<commit_message>
Measure the curve, and take back most of the flat result
논문 4 의 가장 큰 미검증 요인이 곡면이었다. 화장품 용기는 원통인데 측정은 평면
호모그래피였다. 원통에 감긴 마커는 각도를 달리 본 평면이 아니다 — 중심선에서
멀어질수록 표면이 돌아서 마커의 정사각형이 폭 방향으로 불균등하게 압축된다.
호모그래피가 표현하지 못하는 변형이다.

원통면에 투영해 다시 쟀다. 결과가 평면 수치를 되돌린다. 20mm 마커 기준으로
넓은 단지는 30도, 세럼 병은 15도, 립밤은 정면에서만 읽힌다. 평면에서 주장한
70도는 라벨 카드 같은 평평한 표면에서만 성립한다.

정면 검출은 곡률과 무관하다. 무너지는 것은 각도 내성이고, 그래서 설계 변수가
하나에서 둘이 된다 — 포장이 내줄 면적, 그리고 그 면적이 놓인 곡률.

첫 구현에는 렌더링 버그가 있었다. 원본 열에서 출력 열로 순방향 매핑하면 출력에
빈틈이 생겨 마커를 가로지르는 줄무늬가 되고, 곡률과 무관한 이유로 검출이
깨진다. 결과가 비단조적으로 나온 것이 그 증거였다. 출력 열마다 원본을 역으로
샘플링해 고쳤다.

초록과 결론을 고쳤다. "비조준 경로가 성립한다"는 유지하되 "평면 측정이 제시하는
만큼 관대하지 않다"를 붙였다. 넓은 용기에서는 성립하고 가는 용기에서는 성립하지
않는다.

Co-Authored-By: Claude Opus 5 (1M context) <noreply@anthropic.com>
</commit_message>
<xml_diff>
--- a/paper4/draft_en.docx
+++ b/paper4/draft_en.docx
@@ -68,7 +68,7 @@
         <w:t>Results.</w:t>
       </w:r>
       <w:r>
-        <w:t xml:space="preserve"> ArUco detection was complete out to 70° off-axis whenever the marker occupied 3.4% of frame width (44 px in a 1280-wide frame), and held head-on down to 0.9% of frame width. Detection failed with size before it failed with angle.</w:t>
+        <w:t xml:space="preserve"> On a flat surface, ArUco detection was complete out to 70° off-axis whenever the marker occupied 3.4% of frame width (44 px in a 1280-wide frame). Wrapping the marker onto a cylinder narrowed angle tolerance sharply: at a marker spanning 20% of the container circumference — a serum bottle — tolerance fell to 15°, and at 40% — a lip balm — the marker was read only head-on.</w:t>
       </w:r>
     </w:p>
     <w:p>
@@ -79,7 +79,16 @@
         <w:t>Conclusions.</w:t>
       </w:r>
       <w:r>
-        <w:t xml:space="preserve"> A non-aim recognition route exists without a commercial licence. The design constraint is not how accurately the user aims but how much package area a marker can claim. The measurements are an upper bound from synthetic scenes, and cylindrical packaging is untested. The pipeline reports what the label states and what labelling rules single out; it does not assess safety.</w:t>
+        <w:t xml:space="preserve"> A non-aim recognition route exists without a commercial licence, but it is less forgiving than the planar measurement suggests. The design constraints are package area </w:t>
+      </w:r>
+      <w:r>
+        <w:rPr>
+          <w:b/>
+        </w:rPr>
+        <w:t>and container curvature</w:t>
+      </w:r>
+      <w:r>
+        <w:t>: the tighter the curve, the closer to square on the user must hold the camera. Non-aim reading holds on wide containers and does not hold on narrow ones. The pipeline reports what the label states and what labelling rules single out; it does not assess safety.</w:t>
       </w:r>
     </w:p>
     <w:p>
@@ -892,12 +901,585 @@
         <w:pStyle w:val="Heading3"/>
       </w:pPr>
       <w:r>
-        <w:t>3.1 The shape of the failure</w:t>
+        <w:t>3.1 Re-measuring on a curved surface</w:t>
       </w:r>
     </w:p>
     <w:p>
       <w:r>
-        <w:t>The informative part of the measurement is not the ceiling but how it collapses (Fig. 1). Detection fails with size before it fails with angle. The design constraint is therefore how much package area a marker can claim, not how carefully the user aims, which inverts QR's assumption.</w:t>
+        <w:t>Cosmetics packaging is mostly cylindrical. A marker wrapped around a bottle is not a plane seen at an angle: the further from the centre line, the more the surface turns away, so the marker's own squares compress unevenly across its width. A homography cannot express that.</w:t>
+      </w:r>
+    </w:p>
+    <w:p>
+      <w:r>
+        <w:t>We projected the marker onto a cylinder and measured again. The free parameter is the ratio of marker width to container circumference.</w:t>
+      </w:r>
+    </w:p>
+    <w:p>
+      <w:r>
+        <w:rPr>
+          <w:b/>
+        </w:rPr>
+        <w:t>Table 2.</w:t>
+      </w:r>
+      <w:r>
+        <w:t xml:space="preserve"> Detection on a cylinder. Marker 120 px, twelve trials per condition.</w:t>
+      </w:r>
+    </w:p>
+    <w:tbl>
+      <w:tblPr>
+        <w:tblStyle w:val="TableGrid"/>
+        <w:tblW w:type="auto" w:w="0"/>
+        <w:tblLook w:firstColumn="1" w:firstRow="1" w:lastColumn="0" w:lastRow="0" w:noHBand="0" w:noVBand="1" w:val="04A0"/>
+      </w:tblPr>
+      <w:tblGrid>
+        <w:gridCol w:w="1440"/>
+        <w:gridCol w:w="1440"/>
+        <w:gridCol w:w="1440"/>
+        <w:gridCol w:w="1440"/>
+        <w:gridCol w:w="1440"/>
+        <w:gridCol w:w="1440"/>
+      </w:tblGrid>
+      <w:tr>
+        <w:tc>
+          <w:tcPr>
+            <w:tcW w:type="dxa" w:w="1440"/>
+          </w:tcPr>
+          <w:p>
+            <w:r>
+              <w:rPr>
+                <w:b/>
+              </w:rPr>
+            </w:r>
+            <w:r>
+              <w:rPr>
+                <w:b/>
+              </w:rPr>
+              <w:t>Marker width / circumference</w:t>
+            </w:r>
+          </w:p>
+        </w:tc>
+        <w:tc>
+          <w:tcPr>
+            <w:tcW w:type="dxa" w:w="1440"/>
+          </w:tcPr>
+          <w:p>
+            <w:r>
+              <w:rPr>
+                <w:b/>
+              </w:rPr>
+            </w:r>
+            <w:r>
+              <w:rPr>
+                <w:b/>
+              </w:rPr>
+              <w:t>0°</w:t>
+            </w:r>
+          </w:p>
+        </w:tc>
+        <w:tc>
+          <w:tcPr>
+            <w:tcW w:type="dxa" w:w="1440"/>
+          </w:tcPr>
+          <w:p>
+            <w:r>
+              <w:rPr>
+                <w:b/>
+              </w:rPr>
+            </w:r>
+            <w:r>
+              <w:rPr>
+                <w:b/>
+              </w:rPr>
+              <w:t>15°</w:t>
+            </w:r>
+          </w:p>
+        </w:tc>
+        <w:tc>
+          <w:tcPr>
+            <w:tcW w:type="dxa" w:w="1440"/>
+          </w:tcPr>
+          <w:p>
+            <w:r>
+              <w:rPr>
+                <w:b/>
+              </w:rPr>
+            </w:r>
+            <w:r>
+              <w:rPr>
+                <w:b/>
+              </w:rPr>
+              <w:t>30°</w:t>
+            </w:r>
+          </w:p>
+        </w:tc>
+        <w:tc>
+          <w:tcPr>
+            <w:tcW w:type="dxa" w:w="1440"/>
+          </w:tcPr>
+          <w:p>
+            <w:r>
+              <w:rPr>
+                <w:b/>
+              </w:rPr>
+            </w:r>
+            <w:r>
+              <w:rPr>
+                <w:b/>
+              </w:rPr>
+              <w:t>45°</w:t>
+            </w:r>
+          </w:p>
+        </w:tc>
+        <w:tc>
+          <w:tcPr>
+            <w:tcW w:type="dxa" w:w="1440"/>
+          </w:tcPr>
+          <w:p>
+            <w:r>
+              <w:rPr>
+                <w:b/>
+              </w:rPr>
+            </w:r>
+            <w:r>
+              <w:rPr>
+                <w:b/>
+              </w:rPr>
+              <w:t>60°</w:t>
+            </w:r>
+          </w:p>
+        </w:tc>
+      </w:tr>
+      <w:tr>
+        <w:tc>
+          <w:tcPr>
+            <w:tcW w:type="dxa" w:w="1440"/>
+          </w:tcPr>
+          <w:p>
+            <w:r/>
+            <w:r>
+              <w:t>flat (label card)</w:t>
+            </w:r>
+          </w:p>
+        </w:tc>
+        <w:tc>
+          <w:tcPr>
+            <w:tcW w:type="dxa" w:w="1440"/>
+          </w:tcPr>
+          <w:p>
+            <w:r/>
+            <w:r>
+              <w:t>100%</w:t>
+            </w:r>
+          </w:p>
+        </w:tc>
+        <w:tc>
+          <w:tcPr>
+            <w:tcW w:type="dxa" w:w="1440"/>
+          </w:tcPr>
+          <w:p>
+            <w:r/>
+            <w:r>
+              <w:t>100%</w:t>
+            </w:r>
+          </w:p>
+        </w:tc>
+        <w:tc>
+          <w:tcPr>
+            <w:tcW w:type="dxa" w:w="1440"/>
+          </w:tcPr>
+          <w:p>
+            <w:r/>
+            <w:r>
+              <w:t>100%</w:t>
+            </w:r>
+          </w:p>
+        </w:tc>
+        <w:tc>
+          <w:tcPr>
+            <w:tcW w:type="dxa" w:w="1440"/>
+          </w:tcPr>
+          <w:p>
+            <w:r/>
+            <w:r>
+              <w:t>100%</w:t>
+            </w:r>
+          </w:p>
+        </w:tc>
+        <w:tc>
+          <w:tcPr>
+            <w:tcW w:type="dxa" w:w="1440"/>
+          </w:tcPr>
+          <w:p>
+            <w:r/>
+            <w:r>
+              <w:t>100%</w:t>
+            </w:r>
+          </w:p>
+        </w:tc>
+      </w:tr>
+      <w:tr>
+        <w:tc>
+          <w:tcPr>
+            <w:tcW w:type="dxa" w:w="1440"/>
+          </w:tcPr>
+          <w:p>
+            <w:r/>
+            <w:r>
+              <w:t>0.10 (wide jar, d = 70 mm)</w:t>
+            </w:r>
+          </w:p>
+        </w:tc>
+        <w:tc>
+          <w:tcPr>
+            <w:tcW w:type="dxa" w:w="1440"/>
+          </w:tcPr>
+          <w:p>
+            <w:r/>
+            <w:r>
+              <w:t>100%</w:t>
+            </w:r>
+          </w:p>
+        </w:tc>
+        <w:tc>
+          <w:tcPr>
+            <w:tcW w:type="dxa" w:w="1440"/>
+          </w:tcPr>
+          <w:p>
+            <w:r/>
+            <w:r>
+              <w:t>100%</w:t>
+            </w:r>
+          </w:p>
+        </w:tc>
+        <w:tc>
+          <w:tcPr>
+            <w:tcW w:type="dxa" w:w="1440"/>
+          </w:tcPr>
+          <w:p>
+            <w:r/>
+            <w:r>
+              <w:t>100%</w:t>
+            </w:r>
+          </w:p>
+        </w:tc>
+        <w:tc>
+          <w:tcPr>
+            <w:tcW w:type="dxa" w:w="1440"/>
+          </w:tcPr>
+          <w:p>
+            <w:r/>
+            <w:r>
+              <w:t>0%</w:t>
+            </w:r>
+          </w:p>
+        </w:tc>
+        <w:tc>
+          <w:tcPr>
+            <w:tcW w:type="dxa" w:w="1440"/>
+          </w:tcPr>
+          <w:p>
+            <w:r/>
+            <w:r>
+              <w:t>0%</w:t>
+            </w:r>
+          </w:p>
+        </w:tc>
+      </w:tr>
+      <w:tr>
+        <w:tc>
+          <w:tcPr>
+            <w:tcW w:type="dxa" w:w="1440"/>
+          </w:tcPr>
+          <w:p>
+            <w:r/>
+            <w:r>
+              <w:t>0.20 (serum bottle, d = 30 mm)</w:t>
+            </w:r>
+          </w:p>
+        </w:tc>
+        <w:tc>
+          <w:tcPr>
+            <w:tcW w:type="dxa" w:w="1440"/>
+          </w:tcPr>
+          <w:p>
+            <w:r/>
+            <w:r>
+              <w:t>100%</w:t>
+            </w:r>
+          </w:p>
+        </w:tc>
+        <w:tc>
+          <w:tcPr>
+            <w:tcW w:type="dxa" w:w="1440"/>
+          </w:tcPr>
+          <w:p>
+            <w:r/>
+            <w:r>
+              <w:t>100%</w:t>
+            </w:r>
+          </w:p>
+        </w:tc>
+        <w:tc>
+          <w:tcPr>
+            <w:tcW w:type="dxa" w:w="1440"/>
+          </w:tcPr>
+          <w:p>
+            <w:r/>
+            <w:r>
+              <w:t>0%</w:t>
+            </w:r>
+          </w:p>
+        </w:tc>
+        <w:tc>
+          <w:tcPr>
+            <w:tcW w:type="dxa" w:w="1440"/>
+          </w:tcPr>
+          <w:p>
+            <w:r/>
+            <w:r>
+              <w:t>0%</w:t>
+            </w:r>
+          </w:p>
+        </w:tc>
+        <w:tc>
+          <w:tcPr>
+            <w:tcW w:type="dxa" w:w="1440"/>
+          </w:tcPr>
+          <w:p>
+            <w:r/>
+            <w:r>
+              <w:t>0%</w:t>
+            </w:r>
+          </w:p>
+        </w:tc>
+      </w:tr>
+      <w:tr>
+        <w:tc>
+          <w:tcPr>
+            <w:tcW w:type="dxa" w:w="1440"/>
+          </w:tcPr>
+          <w:p>
+            <w:r/>
+            <w:r>
+              <w:t>0.30</w:t>
+            </w:r>
+          </w:p>
+        </w:tc>
+        <w:tc>
+          <w:tcPr>
+            <w:tcW w:type="dxa" w:w="1440"/>
+          </w:tcPr>
+          <w:p>
+            <w:r/>
+            <w:r>
+              <w:t>100%</w:t>
+            </w:r>
+          </w:p>
+        </w:tc>
+        <w:tc>
+          <w:tcPr>
+            <w:tcW w:type="dxa" w:w="1440"/>
+          </w:tcPr>
+          <w:p>
+            <w:r/>
+            <w:r>
+              <w:t>100%</w:t>
+            </w:r>
+          </w:p>
+        </w:tc>
+        <w:tc>
+          <w:tcPr>
+            <w:tcW w:type="dxa" w:w="1440"/>
+          </w:tcPr>
+          <w:p>
+            <w:r/>
+            <w:r>
+              <w:t>0%</w:t>
+            </w:r>
+          </w:p>
+        </w:tc>
+        <w:tc>
+          <w:tcPr>
+            <w:tcW w:type="dxa" w:w="1440"/>
+          </w:tcPr>
+          <w:p>
+            <w:r/>
+            <w:r>
+              <w:t>0%</w:t>
+            </w:r>
+          </w:p>
+        </w:tc>
+        <w:tc>
+          <w:tcPr>
+            <w:tcW w:type="dxa" w:w="1440"/>
+          </w:tcPr>
+          <w:p>
+            <w:r/>
+            <w:r>
+              <w:t>0%</w:t>
+            </w:r>
+          </w:p>
+        </w:tc>
+      </w:tr>
+      <w:tr>
+        <w:tc>
+          <w:tcPr>
+            <w:tcW w:type="dxa" w:w="1440"/>
+          </w:tcPr>
+          <w:p>
+            <w:r/>
+            <w:r>
+              <w:t>0.40 (lip balm, d = 16 mm)</w:t>
+            </w:r>
+          </w:p>
+        </w:tc>
+        <w:tc>
+          <w:tcPr>
+            <w:tcW w:type="dxa" w:w="1440"/>
+          </w:tcPr>
+          <w:p>
+            <w:r/>
+            <w:r>
+              <w:t>100%</w:t>
+            </w:r>
+          </w:p>
+        </w:tc>
+        <w:tc>
+          <w:tcPr>
+            <w:tcW w:type="dxa" w:w="1440"/>
+          </w:tcPr>
+          <w:p>
+            <w:r/>
+            <w:r>
+              <w:t>0%</w:t>
+            </w:r>
+          </w:p>
+        </w:tc>
+        <w:tc>
+          <w:tcPr>
+            <w:tcW w:type="dxa" w:w="1440"/>
+          </w:tcPr>
+          <w:p>
+            <w:r/>
+            <w:r>
+              <w:t>0%</w:t>
+            </w:r>
+          </w:p>
+        </w:tc>
+        <w:tc>
+          <w:tcPr>
+            <w:tcW w:type="dxa" w:w="1440"/>
+          </w:tcPr>
+          <w:p>
+            <w:r/>
+            <w:r>
+              <w:t>0%</w:t>
+            </w:r>
+          </w:p>
+        </w:tc>
+        <w:tc>
+          <w:tcPr>
+            <w:tcW w:type="dxa" w:w="1440"/>
+          </w:tcPr>
+          <w:p>
+            <w:r/>
+            <w:r>
+              <w:t>0%</w:t>
+            </w:r>
+          </w:p>
+        </w:tc>
+      </w:tr>
+      <w:tr>
+        <w:tc>
+          <w:tcPr>
+            <w:tcW w:type="dxa" w:w="1440"/>
+          </w:tcPr>
+          <w:p>
+            <w:r/>
+            <w:r>
+              <w:t>0.50</w:t>
+            </w:r>
+          </w:p>
+        </w:tc>
+        <w:tc>
+          <w:tcPr>
+            <w:tcW w:type="dxa" w:w="1440"/>
+          </w:tcPr>
+          <w:p>
+            <w:r/>
+            <w:r>
+              <w:t>100%</w:t>
+            </w:r>
+          </w:p>
+        </w:tc>
+        <w:tc>
+          <w:tcPr>
+            <w:tcW w:type="dxa" w:w="1440"/>
+          </w:tcPr>
+          <w:p>
+            <w:r/>
+            <w:r>
+              <w:t>0%</w:t>
+            </w:r>
+          </w:p>
+        </w:tc>
+        <w:tc>
+          <w:tcPr>
+            <w:tcW w:type="dxa" w:w="1440"/>
+          </w:tcPr>
+          <w:p>
+            <w:r/>
+            <w:r>
+              <w:t>0%</w:t>
+            </w:r>
+          </w:p>
+        </w:tc>
+        <w:tc>
+          <w:tcPr>
+            <w:tcW w:type="dxa" w:w="1440"/>
+          </w:tcPr>
+          <w:p>
+            <w:r/>
+            <w:r>
+              <w:t>0%</w:t>
+            </w:r>
+          </w:p>
+        </w:tc>
+        <w:tc>
+          <w:tcPr>
+            <w:tcW w:type="dxa" w:w="1440"/>
+          </w:tcPr>
+          <w:p>
+            <w:r/>
+            <w:r>
+              <w:t>0%</w:t>
+            </w:r>
+          </w:p>
+        </w:tc>
+      </w:tr>
+    </w:tbl>
+    <w:p/>
+    <w:p>
+      <w:r>
+        <w:t>Head-on detection is unaffected by curvature. What collapses is angle tolerance (Fig. 2).</w:t>
+      </w:r>
+    </w:p>
+    <w:p>
+      <w:r>
+        <w:t>This retracts much of the planar result. For a 20 mm marker: 30° on a wide jar, 15° on a serum bottle, head-on only on a lip balm.</w:t>
+      </w:r>
+    </w:p>
+    <w:p>
+      <w:pPr>
+        <w:pStyle w:val="Heading3"/>
+      </w:pPr>
+      <w:r>
+        <w:t>3.2 The shape of the failure</w:t>
+      </w:r>
+    </w:p>
+    <w:p>
+      <w:r>
+        <w:t>On a flat surface, detection fails with size before it fails with angle (Fig. 1). On a curved one, angle binds first. The two constraints act together, so there are two design variables: the area a package can give up, and the curvature that area sits on.</w:t>
       </w:r>
     </w:p>
     <w:p>
@@ -957,7 +1539,7 @@
         <w:pStyle w:val="ListBullet"/>
       </w:pPr>
       <w:r>
-        <w:t>Cosmetics packaging is mostly cylindrical, while the measurement uses a planar homography. This is the largest gap between the numbers and reality.</w:t>
+        <w:t>The cylinder measurement is also synthetic and excludes specular highlights. Glossy containers are the largest remaining untested factor.</w:t>
       </w:r>
     </w:p>
     <w:p>
@@ -1005,7 +1587,7 @@
         <w:pStyle w:val="ListBullet"/>
       </w:pPr>
       <w:r>
-        <w:t>Detection on cylindrical surfaces, which the synthetic test cannot answer.</w:t>
+        <w:t>Specular highlights on glossy containers, which the synthetic test cannot answer.</w:t>
       </w:r>
     </w:p>
     <w:p>
@@ -1026,7 +1608,7 @@
     </w:p>
     <w:p>
       <w:r>
-        <w:t>A non-aim recognition route exists without a commercial licence, and its constraint is package area rather than user aim. The ingredient summary conveys the label's content and what labelling rules single out, with interpretation placed explicitly out of scope.</w:t>
+        <w:t>A non-aim recognition route exists without a commercial licence, but how forgiving it is depends on container shape: 70° on a flat label, 30° on a wide container, near head-on only on a narrow one. The constraints are package area and curvature. The ingredient summary conveys the label's content and what labelling rules single out, with interpretation placed explicitly out of scope.</w:t>
       </w:r>
     </w:p>
     <w:p>
@@ -1044,6 +1626,8 @@
           <w:sz w:val="18"/>
         </w:rPr>
         <w:t>python scripts/marker_feasibility.py</w:t>
+        <w:br/>
+        <w:t>python scripts/marker_cylinder.py</w:t>
         <w:br/>
         <w:t>python -c "from pipeline.ingredient_summary import summarize; print(summarize('Water, Glycerin, Linalool'))"</w:t>
       </w:r>
@@ -1155,7 +1739,63 @@
           <w:color w:val="444444"/>
           <w:sz w:val="18"/>
         </w:rPr>
-        <w:t xml:space="preserve"> ArUco detection rate by marker size and off-axis angle. Failing cells cluster at the bottom (small markers) rather than at the right (wide angles). Twelve trials per condition, synthetic scenes.</w:t>
+        <w:t xml:space="preserve"> ArUco detection rate on a flat surface, by marker size and off-axis angle. Failing cells cluster at the bottom (small markers) rather than at the right (wide angles). Twelve trials per condition, synthetic scenes.</w:t>
+      </w:r>
+    </w:p>
+    <w:p>
+      <w:pPr>
+        <w:jc w:val="center"/>
+      </w:pPr>
+      <w:r>
+        <w:drawing>
+          <wp:inline xmlns:a="http://schemas.openxmlformats.org/drawingml/2006/main" xmlns:pic="http://schemas.openxmlformats.org/drawingml/2006/picture">
+            <wp:extent cx="5486400" cy="2377440"/>
+            <wp:docPr id="2" name="Picture 2"/>
+            <wp:cNvGraphicFramePr>
+              <a:graphicFrameLocks noChangeAspect="1"/>
+            </wp:cNvGraphicFramePr>
+            <a:graphic>
+              <a:graphicData uri="http://schemas.openxmlformats.org/drawingml/2006/picture">
+                <pic:pic>
+                  <pic:nvPicPr>
+                    <pic:cNvPr id="0" name="Fig2.png"/>
+                    <pic:cNvPicPr/>
+                  </pic:nvPicPr>
+                  <pic:blipFill>
+                    <a:blip r:embed="rId10"/>
+                    <a:stretch>
+                      <a:fillRect/>
+                    </a:stretch>
+                  </pic:blipFill>
+                  <pic:spPr>
+                    <a:xfrm>
+                      <a:off x="0" y="0"/>
+                      <a:ext cx="5486400" cy="2377440"/>
+                    </a:xfrm>
+                    <a:prstGeom prst="rect"/>
+                  </pic:spPr>
+                </pic:pic>
+              </a:graphicData>
+            </a:graphic>
+          </wp:inline>
+        </w:drawing>
+      </w:r>
+    </w:p>
+    <w:p>
+      <w:r>
+        <w:rPr>
+          <w:b/>
+          <w:color w:val="444444"/>
+          <w:sz w:val="18"/>
+        </w:rPr>
+        <w:t>Fig. 2</w:t>
+      </w:r>
+      <w:r>
+        <w:rPr>
+          <w:color w:val="444444"/>
+          <w:sz w:val="18"/>
+        </w:rPr>
+        <w:t xml:space="preserve"> Detection on a cylinder. The larger the share of the container's circumference a marker spans, the narrower the angle tolerance. Head-on detection is unaffected by curvature.</w:t>
       </w:r>
     </w:p>
     <w:sectPr>

</xml_diff>